<commit_message>
Sync resume: Azure DevOps bullets for DEP and Domi Station
</commit_message>
<xml_diff>
--- a/Sai-Nikhil-Gummadavelli-Resume.docx
+++ b/Sai-Nikhil-Gummadavelli-Resume.docx
@@ -430,6 +430,25 @@
     </w:p>
     <w:p>
       <w:pPr>
+        <w:pStyle w:val="ListBullet"/>
+        <w:spacing w:after="20"/>
+        <w:ind w:left="360"/>
+      </w:pPr>
+      <w:r>
+        <w:t xml:space="preserve">Ran release governance in Azure DevOps — gated CI/CD pipelines with automated data-quality checks and approvals before Qlik apps and reports reach production.</w:t>
+      </w:r>
+      <w:r>
+        <w:rPr>
+          <w:b/>
+        </w:rPr>
+        <w:t/>
+      </w:r>
+      <w:r>
+        <w:t xml:space="preserve"/>
+      </w:r>
+    </w:p>
+    <w:p>
+      <w:pPr>
         <w:tabs>
           <w:tab w:pos="10512" w:val="left"/>
         </w:tabs>
@@ -619,6 +638,44 @@
       </w:r>
       <w:r>
         <w:t xml:space="preserve"> and SQL, ensuring consistency across multi-source datasets.</w:t>
+      </w:r>
+    </w:p>
+    <w:p>
+      <w:pPr>
+        <w:pStyle w:val="ListBullet"/>
+        <w:spacing w:after="20"/>
+        <w:ind w:left="360"/>
+      </w:pPr>
+      <w:r>
+        <w:t xml:space="preserve">Set up Azure DevOps Git repos with a trunk-based branching strategy for ETL and analytics code; pull-request reviews and tagged releases replaced ad-hoc script sharing.</w:t>
+      </w:r>
+      <w:r>
+        <w:rPr>
+          <w:b/>
+        </w:rPr>
+        <w:t/>
+      </w:r>
+      <w:r>
+        <w:t xml:space="preserve"/>
+      </w:r>
+    </w:p>
+    <w:p>
+      <w:pPr>
+        <w:pStyle w:val="ListBullet"/>
+        <w:spacing w:after="20"/>
+        <w:ind w:left="360"/>
+      </w:pPr>
+      <w:r>
+        <w:t xml:space="preserve">Built Azure DevOps CI/CD pipelines that run SQL/Python data-quality tests on every commit and trigger Power BI dataset refreshes after successful deployments.</w:t>
+      </w:r>
+      <w:r>
+        <w:rPr>
+          <w:b/>
+        </w:rPr>
+        <w:t/>
+      </w:r>
+      <w:r>
+        <w:t xml:space="preserve"/>
       </w:r>
     </w:p>
     <w:p>

</xml_diff>